<commit_message>
feat(oms-risk|kafka|order-service): risk evaluation wired, rejection reasons centralized, logging refined
</commit_message>
<xml_diff>
--- a/oms code doc.docx
+++ b/oms code doc.docx
@@ -140,23 +140,7 @@
           <w:i/>
           <w:iCs/>
         </w:rPr>
-        <w:t>@</w:t>
-      </w:r>
-      <w:proofErr w:type="gramStart"/>
-      <w:r>
-        <w:rPr>
-          <w:i/>
-          <w:iCs/>
-        </w:rPr>
-        <w:t>Table(</w:t>
-      </w:r>
-      <w:proofErr w:type="gramEnd"/>
-      <w:r>
-        <w:rPr>
-          <w:i/>
-          <w:iCs/>
-        </w:rPr>
-        <w:t>name = "orders")</w:t>
+        <w:t>@Table(name = "orders")</w:t>
       </w:r>
     </w:p>
     <w:p>
@@ -302,23 +286,7 @@
           <w:i/>
           <w:iCs/>
         </w:rPr>
-        <w:t>@</w:t>
-      </w:r>
-      <w:proofErr w:type="gramStart"/>
-      <w:r>
-        <w:rPr>
-          <w:i/>
-          <w:iCs/>
-        </w:rPr>
-        <w:t>GeneratedValue(</w:t>
-      </w:r>
-      <w:proofErr w:type="gramEnd"/>
-      <w:r>
-        <w:rPr>
-          <w:i/>
-          <w:iCs/>
-        </w:rPr>
-        <w:t xml:space="preserve">strategy = </w:t>
+        <w:t xml:space="preserve">@GeneratedValue(strategy = </w:t>
       </w:r>
       <w:proofErr w:type="spellStart"/>
       <w:r>
@@ -451,23 +419,7 @@
           <w:i/>
           <w:iCs/>
         </w:rPr>
-        <w:t>@</w:t>
-      </w:r>
-      <w:proofErr w:type="gramStart"/>
-      <w:r>
-        <w:rPr>
-          <w:i/>
-          <w:iCs/>
-        </w:rPr>
-        <w:t>Enumerated(</w:t>
-      </w:r>
-      <w:proofErr w:type="gramEnd"/>
-      <w:r>
-        <w:rPr>
-          <w:i/>
-          <w:iCs/>
-        </w:rPr>
-        <w:t>EnumType.STRING)</w:t>
+        <w:t>@Enumerated(EnumType.STRING)</w:t>
       </w:r>
     </w:p>
     <w:p>
@@ -680,23 +632,7 @@
           <w:i/>
           <w:iCs/>
         </w:rPr>
-        <w:t>@</w:t>
-      </w:r>
-      <w:proofErr w:type="gramStart"/>
-      <w:r>
-        <w:rPr>
-          <w:i/>
-          <w:iCs/>
-        </w:rPr>
-        <w:t>Column(</w:t>
-      </w:r>
-      <w:proofErr w:type="gramEnd"/>
-      <w:r>
-        <w:rPr>
-          <w:i/>
-          <w:iCs/>
-        </w:rPr>
-        <w:t>name = "</w:t>
+        <w:t>@Column(name = "</w:t>
       </w:r>
       <w:proofErr w:type="spellStart"/>
       <w:r>
@@ -890,15 +826,7 @@
       </w:pPr>
       <w:r>
         <w:lastRenderedPageBreak/>
-        <w:t>For older JPA, you'd need @</w:t>
-      </w:r>
-      <w:proofErr w:type="gramStart"/>
-      <w:r>
-        <w:t>Temporal(</w:t>
-      </w:r>
-      <w:proofErr w:type="gramEnd"/>
-      <w:r>
-        <w:t>TemporalType.TIMESTAMP)</w:t>
+        <w:t>For older JPA, you'd need @Temporal(TemporalType.TIMESTAMP)</w:t>
       </w:r>
     </w:p>
     <w:p>
@@ -1097,7 +1025,1299 @@
         <w:t>@ManyToOne, @OneToMany - For relationships</w:t>
       </w:r>
     </w:p>
+    <w:p>
+      <w:pPr>
+        <w:rPr>
+          <w:b/>
+          <w:bCs/>
+          <w:sz w:val="32"/>
+          <w:szCs w:val="32"/>
+        </w:rPr>
+      </w:pPr>
+      <w:r>
+        <w:br/>
+      </w:r>
+      <w:r>
+        <w:br/>
+      </w:r>
+      <w:r>
+        <w:rPr>
+          <w:b/>
+          <w:bCs/>
+          <w:sz w:val="32"/>
+          <w:szCs w:val="32"/>
+        </w:rPr>
+        <w:t>KAFKA</w:t>
+      </w:r>
+    </w:p>
+    <w:p>
+      <w:proofErr w:type="spellStart"/>
+      <w:r>
+        <w:t>PrePersist</w:t>
+      </w:r>
+      <w:proofErr w:type="spellEnd"/>
+      <w:r>
+        <w:t>/@PreUpdate - For lifecycle</w:t>
+      </w:r>
+    </w:p>
+    <w:p>
+      <w:r>
+        <w:br w:type="page"/>
+      </w:r>
+    </w:p>
+    <w:p>
+      <w:r>
+        <w:rPr>
+          <w:b/>
+          <w:bCs/>
+        </w:rPr>
+        <w:lastRenderedPageBreak/>
+        <w:t>Commands for testing</w:t>
+      </w:r>
+      <w:r>
+        <w:rPr>
+          <w:b/>
+          <w:bCs/>
+        </w:rPr>
+        <w:br/>
+      </w:r>
+      <w:r>
+        <w:t xml:space="preserve"># </w:t>
+      </w:r>
+      <w:r>
+        <w:rPr>
+          <w:rFonts w:ascii="Segoe UI Emoji" w:hAnsi="Segoe UI Emoji" w:cs="Segoe UI Emoji"/>
+        </w:rPr>
+        <w:t>🐳</w:t>
+      </w:r>
+      <w:r>
+        <w:t xml:space="preserve"> Docker Commands</w:t>
+      </w:r>
+    </w:p>
     <w:p/>
+    <w:p>
+      <w:r>
+        <w:t># Start all containers in detached mode</w:t>
+      </w:r>
+    </w:p>
+    <w:p>
+      <w:r>
+        <w:t>docker-compose up -d</w:t>
+      </w:r>
+    </w:p>
+    <w:p/>
+    <w:p>
+      <w:r>
+        <w:t># Stop all containers</w:t>
+      </w:r>
+    </w:p>
+    <w:p>
+      <w:r>
+        <w:t>docker-compose down</w:t>
+      </w:r>
+    </w:p>
+    <w:p/>
+    <w:p>
+      <w:r>
+        <w:t xml:space="preserve"># View logs for a specific container (e.g., </w:t>
+      </w:r>
+      <w:proofErr w:type="spellStart"/>
+      <w:r>
+        <w:t>kafka</w:t>
+      </w:r>
+      <w:proofErr w:type="spellEnd"/>
+      <w:r>
+        <w:t>)</w:t>
+      </w:r>
+    </w:p>
+    <w:p>
+      <w:r>
+        <w:t xml:space="preserve">docker logs </w:t>
+      </w:r>
+      <w:proofErr w:type="spellStart"/>
+      <w:r>
+        <w:t>kafka</w:t>
+      </w:r>
+      <w:proofErr w:type="spellEnd"/>
+    </w:p>
+    <w:p/>
+    <w:p>
+      <w:r>
+        <w:t># Execute Kafka CLI inside container</w:t>
+      </w:r>
+    </w:p>
+    <w:p>
+      <w:r>
+        <w:t xml:space="preserve">docker exec -it </w:t>
+      </w:r>
+      <w:proofErr w:type="spellStart"/>
+      <w:r>
+        <w:t>kafka</w:t>
+      </w:r>
+      <w:proofErr w:type="spellEnd"/>
+      <w:r>
+        <w:t xml:space="preserve"> bash</w:t>
+      </w:r>
+    </w:p>
+    <w:p/>
+    <w:p>
+      <w:r>
+        <w:t># List all Kafka consumer groups</w:t>
+      </w:r>
+    </w:p>
+    <w:p>
+      <w:r>
+        <w:t xml:space="preserve">docker exec -it </w:t>
+      </w:r>
+      <w:proofErr w:type="spellStart"/>
+      <w:r>
+        <w:t>kafka</w:t>
+      </w:r>
+      <w:proofErr w:type="spellEnd"/>
+      <w:r>
+        <w:t xml:space="preserve"> </w:t>
+      </w:r>
+      <w:proofErr w:type="spellStart"/>
+      <w:r>
+        <w:t>kafka</w:t>
+      </w:r>
+      <w:proofErr w:type="spellEnd"/>
+      <w:r>
+        <w:t>-consumer-groups \</w:t>
+      </w:r>
+    </w:p>
+    <w:p>
+      <w:r>
+        <w:t xml:space="preserve">  --bootstrap-server localhost:9092 \</w:t>
+      </w:r>
+    </w:p>
+    <w:p>
+      <w:r>
+        <w:t xml:space="preserve">  --list</w:t>
+      </w:r>
+    </w:p>
+    <w:p/>
+    <w:p>
+      <w:r>
+        <w:t># Describe a specific consumer group</w:t>
+      </w:r>
+    </w:p>
+    <w:p>
+      <w:r>
+        <w:t xml:space="preserve">docker exec -it </w:t>
+      </w:r>
+      <w:proofErr w:type="spellStart"/>
+      <w:r>
+        <w:t>kafka</w:t>
+      </w:r>
+      <w:proofErr w:type="spellEnd"/>
+      <w:r>
+        <w:t xml:space="preserve"> </w:t>
+      </w:r>
+      <w:proofErr w:type="spellStart"/>
+      <w:r>
+        <w:t>kafka</w:t>
+      </w:r>
+      <w:proofErr w:type="spellEnd"/>
+      <w:r>
+        <w:t>-consumer-groups \</w:t>
+      </w:r>
+    </w:p>
+    <w:p>
+      <w:r>
+        <w:t xml:space="preserve">  --bootstrap-server localhost:9092 \</w:t>
+      </w:r>
+    </w:p>
+    <w:p>
+      <w:r>
+        <w:t xml:space="preserve">  --describe \</w:t>
+      </w:r>
+    </w:p>
+    <w:p>
+      <w:r>
+        <w:t xml:space="preserve">  --group oms-risk-service</w:t>
+      </w:r>
+    </w:p>
+    <w:p/>
+    <w:p>
+      <w:r>
+        <w:t># Reset consumer offset to skip old messages</w:t>
+      </w:r>
+    </w:p>
+    <w:p>
+      <w:r>
+        <w:t xml:space="preserve">docker exec -it </w:t>
+      </w:r>
+      <w:proofErr w:type="spellStart"/>
+      <w:r>
+        <w:t>kafka</w:t>
+      </w:r>
+      <w:proofErr w:type="spellEnd"/>
+      <w:r>
+        <w:t xml:space="preserve"> </w:t>
+      </w:r>
+      <w:proofErr w:type="spellStart"/>
+      <w:r>
+        <w:t>kafka</w:t>
+      </w:r>
+      <w:proofErr w:type="spellEnd"/>
+      <w:r>
+        <w:t>-consumer-groups \</w:t>
+      </w:r>
+    </w:p>
+    <w:p>
+      <w:r>
+        <w:lastRenderedPageBreak/>
+        <w:t xml:space="preserve">  --bootstrap-server localhost:9092 \</w:t>
+      </w:r>
+    </w:p>
+    <w:p>
+      <w:r>
+        <w:t xml:space="preserve">  --group oms-risk-service \</w:t>
+      </w:r>
+    </w:p>
+    <w:p>
+      <w:r>
+        <w:t xml:space="preserve">  --reset-offsets --to-latest --execute --topic orders-</w:t>
+      </w:r>
+      <w:proofErr w:type="spellStart"/>
+      <w:r>
+        <w:t>avro</w:t>
+      </w:r>
+      <w:proofErr w:type="spellEnd"/>
+    </w:p>
+    <w:p/>
+    <w:p>
+      <w:r>
+        <w:t># View messages in a topic from beginning</w:t>
+      </w:r>
+    </w:p>
+    <w:p>
+      <w:r>
+        <w:t xml:space="preserve">docker exec -it </w:t>
+      </w:r>
+      <w:proofErr w:type="spellStart"/>
+      <w:r>
+        <w:t>kafka</w:t>
+      </w:r>
+      <w:proofErr w:type="spellEnd"/>
+      <w:r>
+        <w:t xml:space="preserve"> </w:t>
+      </w:r>
+      <w:proofErr w:type="spellStart"/>
+      <w:r>
+        <w:t>kafka</w:t>
+      </w:r>
+      <w:proofErr w:type="spellEnd"/>
+      <w:r>
+        <w:t>-console-consumer \</w:t>
+      </w:r>
+    </w:p>
+    <w:p>
+      <w:r>
+        <w:t xml:space="preserve">  --bootstrap-server localhost:9092 \</w:t>
+      </w:r>
+    </w:p>
+    <w:p>
+      <w:r>
+        <w:t xml:space="preserve">  --topic orders-</w:t>
+      </w:r>
+      <w:proofErr w:type="spellStart"/>
+      <w:r>
+        <w:t>avro</w:t>
+      </w:r>
+      <w:proofErr w:type="spellEnd"/>
+      <w:r>
+        <w:t xml:space="preserve"> \</w:t>
+      </w:r>
+    </w:p>
+    <w:p>
+      <w:r>
+        <w:t xml:space="preserve">  --from-beginning</w:t>
+      </w:r>
+    </w:p>
+    <w:p/>
+    <w:p>
+      <w:r>
+        <w:t># View messages in another topic</w:t>
+      </w:r>
+    </w:p>
+    <w:p>
+      <w:r>
+        <w:t xml:space="preserve">docker exec -it </w:t>
+      </w:r>
+      <w:proofErr w:type="spellStart"/>
+      <w:r>
+        <w:t>kafka</w:t>
+      </w:r>
+      <w:proofErr w:type="spellEnd"/>
+      <w:r>
+        <w:t xml:space="preserve"> </w:t>
+      </w:r>
+      <w:proofErr w:type="spellStart"/>
+      <w:r>
+        <w:t>kafka</w:t>
+      </w:r>
+      <w:proofErr w:type="spellEnd"/>
+      <w:r>
+        <w:t>-console-consumer \</w:t>
+      </w:r>
+    </w:p>
+    <w:p>
+      <w:r>
+        <w:t xml:space="preserve">  --bootstrap-server localhost:9092 \</w:t>
+      </w:r>
+    </w:p>
+    <w:p>
+      <w:r>
+        <w:t xml:space="preserve">  --topic </w:t>
+      </w:r>
+      <w:proofErr w:type="spellStart"/>
+      <w:r>
+        <w:t>risk_approved</w:t>
+      </w:r>
+      <w:proofErr w:type="spellEnd"/>
+      <w:r>
+        <w:t xml:space="preserve"> \</w:t>
+      </w:r>
+    </w:p>
+    <w:p>
+      <w:r>
+        <w:t xml:space="preserve">  --from-beginning</w:t>
+      </w:r>
+    </w:p>
+    <w:p/>
+    <w:p>
+      <w:r>
+        <w:t># Delete a topic (dev only)</w:t>
+      </w:r>
+    </w:p>
+    <w:p>
+      <w:r>
+        <w:t xml:space="preserve">docker exec -it </w:t>
+      </w:r>
+      <w:proofErr w:type="spellStart"/>
+      <w:r>
+        <w:t>kafka</w:t>
+      </w:r>
+      <w:proofErr w:type="spellEnd"/>
+      <w:r>
+        <w:t xml:space="preserve"> </w:t>
+      </w:r>
+      <w:proofErr w:type="spellStart"/>
+      <w:r>
+        <w:t>kafka</w:t>
+      </w:r>
+      <w:proofErr w:type="spellEnd"/>
+      <w:r>
+        <w:t>-topics \</w:t>
+      </w:r>
+    </w:p>
+    <w:p>
+      <w:r>
+        <w:t xml:space="preserve">  --bootstrap-server localhost:9092 \</w:t>
+      </w:r>
+    </w:p>
+    <w:p>
+      <w:r>
+        <w:t xml:space="preserve">  --delete --topic orders-</w:t>
+      </w:r>
+      <w:proofErr w:type="spellStart"/>
+      <w:r>
+        <w:t>avro</w:t>
+      </w:r>
+      <w:proofErr w:type="spellEnd"/>
+      <w:r>
+        <w:br/>
+      </w:r>
+      <w:r>
+        <w:br/>
+      </w:r>
+      <w:r>
+        <w:br/>
+      </w:r>
+      <w:r>
+        <w:t xml:space="preserve"># </w:t>
+      </w:r>
+      <w:r>
+        <w:rPr>
+          <w:rFonts w:ascii="Segoe UI Emoji" w:hAnsi="Segoe UI Emoji" w:cs="Segoe UI Emoji"/>
+        </w:rPr>
+        <w:t>📦</w:t>
+      </w:r>
+      <w:r>
+        <w:t xml:space="preserve"> Schema Registry Commands</w:t>
+      </w:r>
+    </w:p>
+    <w:p/>
+    <w:p>
+      <w:r>
+        <w:t># List all registered schemas</w:t>
+      </w:r>
+    </w:p>
+    <w:p>
+      <w:r>
+        <w:t>curl http://localhost:8081/subjects</w:t>
+      </w:r>
+    </w:p>
+    <w:p/>
+    <w:p>
+      <w:r>
+        <w:t># View latest schema for a subject</w:t>
+      </w:r>
+    </w:p>
+    <w:p>
+      <w:r>
+        <w:t>curl http://localhost:8081/subjects/orders-avro-value/versions/latest</w:t>
+      </w:r>
+    </w:p>
+    <w:p/>
+    <w:p>
+      <w:r>
+        <w:t># Manually register a schema (replace &lt;your-schema-</w:t>
+      </w:r>
+      <w:proofErr w:type="spellStart"/>
+      <w:r>
+        <w:t>json</w:t>
+      </w:r>
+      <w:proofErr w:type="spellEnd"/>
+      <w:r>
+        <w:t>&gt;)</w:t>
+      </w:r>
+    </w:p>
+    <w:p>
+      <w:r>
+        <w:t>curl -X POST http://localhost:8081/subjects/orders-avro-value/versions \</w:t>
+      </w:r>
+    </w:p>
+    <w:p>
+      <w:r>
+        <w:t xml:space="preserve">  -H "Content-Type: application/vnd.schemaregistry.v1+json" \</w:t>
+      </w:r>
+    </w:p>
+    <w:p>
+      <w:r>
+        <w:t xml:space="preserve">  -d '{"schema": "&lt;your Avro schema as JSON string&gt;"}'</w:t>
+      </w:r>
+      <w:r>
+        <w:br/>
+      </w:r>
+      <w:r>
+        <w:br/>
+      </w:r>
+      <w:r>
+        <w:br/>
+      </w:r>
+      <w:r>
+        <w:br/>
+      </w:r>
+      <w:r>
+        <w:br/>
+      </w:r>
+      <w:r>
+        <w:br/>
+      </w:r>
+      <w:r>
+        <w:t xml:space="preserve"># </w:t>
+      </w:r>
+      <w:r>
+        <w:rPr>
+          <w:rFonts w:ascii="Segoe UI Emoji" w:hAnsi="Segoe UI Emoji" w:cs="Segoe UI Emoji"/>
+        </w:rPr>
+        <w:t>🛠️</w:t>
+      </w:r>
+      <w:r>
+        <w:t xml:space="preserve"> Maven Commands</w:t>
+      </w:r>
+    </w:p>
+    <w:p/>
+    <w:p>
+      <w:r>
+        <w:t># Clean and install all modules</w:t>
+      </w:r>
+    </w:p>
+    <w:p>
+      <w:proofErr w:type="spellStart"/>
+      <w:r>
+        <w:t>mvn</w:t>
+      </w:r>
+      <w:proofErr w:type="spellEnd"/>
+      <w:r>
+        <w:t xml:space="preserve"> clean install -</w:t>
+      </w:r>
+      <w:proofErr w:type="spellStart"/>
+      <w:r>
+        <w:t>DskipTests</w:t>
+      </w:r>
+      <w:proofErr w:type="spellEnd"/>
+    </w:p>
+    <w:p/>
+    <w:p>
+      <w:r>
+        <w:t># Rebuild a specific module</w:t>
+      </w:r>
+    </w:p>
+    <w:p>
+      <w:proofErr w:type="spellStart"/>
+      <w:r>
+        <w:t>mvn</w:t>
+      </w:r>
+      <w:proofErr w:type="spellEnd"/>
+      <w:r>
+        <w:t xml:space="preserve"> clean install -</w:t>
+      </w:r>
+      <w:proofErr w:type="spellStart"/>
+      <w:r>
+        <w:t>DskipTests</w:t>
+      </w:r>
+      <w:proofErr w:type="spellEnd"/>
+      <w:r>
+        <w:t xml:space="preserve"> -pl oms-risk-service</w:t>
+      </w:r>
+    </w:p>
+    <w:p/>
+    <w:p>
+      <w:r>
+        <w:t># Rebuild and resume from failed module</w:t>
+      </w:r>
+    </w:p>
+    <w:p>
+      <w:proofErr w:type="spellStart"/>
+      <w:r>
+        <w:t>mvn</w:t>
+      </w:r>
+      <w:proofErr w:type="spellEnd"/>
+      <w:r>
+        <w:t xml:space="preserve"> clean install -</w:t>
+      </w:r>
+      <w:proofErr w:type="spellStart"/>
+      <w:r>
+        <w:t>DskipTests</w:t>
+      </w:r>
+      <w:proofErr w:type="spellEnd"/>
+      <w:r>
+        <w:t xml:space="preserve"> -rf :oms-risk-service</w:t>
+      </w:r>
+      <w:r>
+        <w:br/>
+      </w:r>
+      <w:r>
+        <w:br/>
+      </w:r>
+      <w:r>
+        <w:br/>
+      </w:r>
+      <w:r>
+        <w:t xml:space="preserve"># </w:t>
+      </w:r>
+      <w:r>
+        <w:rPr>
+          <w:rFonts w:ascii="Segoe UI Emoji" w:hAnsi="Segoe UI Emoji" w:cs="Segoe UI Emoji"/>
+        </w:rPr>
+        <w:t>✅</w:t>
+      </w:r>
+      <w:r>
+        <w:t xml:space="preserve"> </w:t>
+      </w:r>
+      <w:proofErr w:type="spellStart"/>
+      <w:r>
+        <w:t>application.properties</w:t>
+      </w:r>
+      <w:proofErr w:type="spellEnd"/>
+      <w:r>
+        <w:t xml:space="preserve"> (consumer config)</w:t>
+      </w:r>
+    </w:p>
+    <w:p>
+      <w:proofErr w:type="spellStart"/>
+      <w:r>
+        <w:t>spring.kafka.consumer.properties.specific.avro.reader</w:t>
+      </w:r>
+      <w:proofErr w:type="spellEnd"/>
+      <w:r>
+        <w:t>=true</w:t>
+      </w:r>
+      <w:r>
+        <w:br/>
+      </w:r>
+      <w:r>
+        <w:br/>
+      </w:r>
+      <w:r>
+        <w:br/>
+      </w:r>
+      <w:r>
+        <w:br/>
+      </w:r>
+      <w:r>
+        <w:t xml:space="preserve">// </w:t>
+      </w:r>
+      <w:r>
+        <w:rPr>
+          <w:rFonts w:ascii="Segoe UI Emoji" w:hAnsi="Segoe UI Emoji" w:cs="Segoe UI Emoji"/>
+        </w:rPr>
+        <w:t>🧭</w:t>
+      </w:r>
+      <w:r>
+        <w:t xml:space="preserve"> Kafka Listener Setup (correct method signature)</w:t>
+      </w:r>
+    </w:p>
+    <w:p>
+      <w:r>
+        <w:t>@KafkaListener(</w:t>
+      </w:r>
+    </w:p>
+    <w:p>
+      <w:r>
+        <w:t xml:space="preserve">  topics = "orders-</w:t>
+      </w:r>
+      <w:proofErr w:type="spellStart"/>
+      <w:r>
+        <w:t>avro</w:t>
+      </w:r>
+      <w:proofErr w:type="spellEnd"/>
+      <w:r>
+        <w:t>",</w:t>
+      </w:r>
+    </w:p>
+    <w:p>
+      <w:r>
+        <w:t xml:space="preserve">  </w:t>
+      </w:r>
+      <w:proofErr w:type="spellStart"/>
+      <w:r>
+        <w:t>groupId</w:t>
+      </w:r>
+      <w:proofErr w:type="spellEnd"/>
+      <w:r>
+        <w:t xml:space="preserve"> = "oms-risk-service",</w:t>
+      </w:r>
+    </w:p>
+    <w:p>
+      <w:r>
+        <w:t xml:space="preserve">  </w:t>
+      </w:r>
+      <w:proofErr w:type="spellStart"/>
+      <w:r>
+        <w:t>containerFactory</w:t>
+      </w:r>
+      <w:proofErr w:type="spellEnd"/>
+      <w:r>
+        <w:t xml:space="preserve"> = "</w:t>
+      </w:r>
+      <w:proofErr w:type="spellStart"/>
+      <w:r>
+        <w:t>kafkaListenerContainerFactory</w:t>
+      </w:r>
+      <w:proofErr w:type="spellEnd"/>
+      <w:r>
+        <w:t>"</w:t>
+      </w:r>
+    </w:p>
+    <w:p>
+      <w:r>
+        <w:lastRenderedPageBreak/>
+        <w:t>)</w:t>
+      </w:r>
+    </w:p>
+    <w:p>
+      <w:r>
+        <w:t xml:space="preserve">public void </w:t>
+      </w:r>
+      <w:proofErr w:type="spellStart"/>
+      <w:r>
+        <w:t>handleOrderPlaced</w:t>
+      </w:r>
+      <w:proofErr w:type="spellEnd"/>
+      <w:r>
+        <w:t>(</w:t>
+      </w:r>
+      <w:proofErr w:type="spellStart"/>
+      <w:r>
+        <w:t>OrderPlacedEvent</w:t>
+      </w:r>
+      <w:proofErr w:type="spellEnd"/>
+      <w:r>
+        <w:t xml:space="preserve"> event) {</w:t>
+      </w:r>
+    </w:p>
+    <w:p>
+      <w:r>
+        <w:t xml:space="preserve">    log.info("Kafka listener triggered");</w:t>
+      </w:r>
+    </w:p>
+    <w:p>
+      <w:r>
+        <w:t xml:space="preserve">    log.info("Received </w:t>
+      </w:r>
+      <w:proofErr w:type="spellStart"/>
+      <w:r>
+        <w:t>OrderPlacedEvent</w:t>
+      </w:r>
+      <w:proofErr w:type="spellEnd"/>
+      <w:r>
+        <w:t xml:space="preserve">: </w:t>
+      </w:r>
+      <w:proofErr w:type="spellStart"/>
+      <w:r>
+        <w:t>orderId</w:t>
+      </w:r>
+      <w:proofErr w:type="spellEnd"/>
+      <w:r>
+        <w:t>={}, symbol={}, quantity={}, price={}",</w:t>
+      </w:r>
+    </w:p>
+    <w:p>
+      <w:r>
+        <w:t xml:space="preserve">             </w:t>
+      </w:r>
+      <w:proofErr w:type="spellStart"/>
+      <w:r>
+        <w:t>event.getOrderId</w:t>
+      </w:r>
+      <w:proofErr w:type="spellEnd"/>
+      <w:r>
+        <w:t xml:space="preserve">(), </w:t>
+      </w:r>
+      <w:proofErr w:type="spellStart"/>
+      <w:r>
+        <w:t>event.getSymbol</w:t>
+      </w:r>
+      <w:proofErr w:type="spellEnd"/>
+      <w:r>
+        <w:t xml:space="preserve">(), </w:t>
+      </w:r>
+      <w:proofErr w:type="spellStart"/>
+      <w:r>
+        <w:t>event.getQuantity</w:t>
+      </w:r>
+      <w:proofErr w:type="spellEnd"/>
+      <w:r>
+        <w:t xml:space="preserve">(), </w:t>
+      </w:r>
+      <w:proofErr w:type="spellStart"/>
+      <w:r>
+        <w:t>event.getPrice</w:t>
+      </w:r>
+      <w:proofErr w:type="spellEnd"/>
+      <w:r>
+        <w:t>());</w:t>
+      </w:r>
+    </w:p>
+    <w:p>
+      <w:r>
+        <w:t xml:space="preserve">    ...</w:t>
+      </w:r>
+    </w:p>
+    <w:p>
+      <w:r>
+        <w:t>}</w:t>
+      </w:r>
+      <w:r>
+        <w:br/>
+      </w:r>
+      <w:r>
+        <w:br/>
+      </w:r>
+      <w:r>
+        <w:br/>
+      </w:r>
+      <w:r>
+        <w:t xml:space="preserve">// </w:t>
+      </w:r>
+      <w:r>
+        <w:rPr>
+          <w:rFonts w:ascii="Segoe UI Emoji" w:hAnsi="Segoe UI Emoji" w:cs="Segoe UI Emoji"/>
+        </w:rPr>
+        <w:t>🧠</w:t>
+      </w:r>
+      <w:r>
+        <w:t xml:space="preserve"> Debug raw payload type</w:t>
+      </w:r>
+    </w:p>
+    <w:p>
+      <w:r>
+        <w:t>@KafkaListener(topics = "orders-</w:t>
+      </w:r>
+      <w:proofErr w:type="spellStart"/>
+      <w:r>
+        <w:t>avro</w:t>
+      </w:r>
+      <w:proofErr w:type="spellEnd"/>
+      <w:r>
+        <w:t xml:space="preserve">", </w:t>
+      </w:r>
+      <w:proofErr w:type="spellStart"/>
+      <w:r>
+        <w:t>groupId</w:t>
+      </w:r>
+      <w:proofErr w:type="spellEnd"/>
+      <w:r>
+        <w:t xml:space="preserve"> = "oms-risk-service")</w:t>
+      </w:r>
+    </w:p>
+    <w:p>
+      <w:r>
+        <w:t xml:space="preserve">public void </w:t>
+      </w:r>
+      <w:proofErr w:type="spellStart"/>
+      <w:r>
+        <w:t>handleRaw</w:t>
+      </w:r>
+      <w:proofErr w:type="spellEnd"/>
+      <w:r>
+        <w:t>(Object payload) {</w:t>
+      </w:r>
+    </w:p>
+    <w:p>
+      <w:r>
+        <w:t xml:space="preserve">    log.info("Received raw payload: {}", </w:t>
+      </w:r>
+      <w:proofErr w:type="spellStart"/>
+      <w:r>
+        <w:t>payload.getClass</w:t>
+      </w:r>
+      <w:proofErr w:type="spellEnd"/>
+      <w:r>
+        <w:t>());</w:t>
+      </w:r>
+    </w:p>
+    <w:p>
+      <w:r>
+        <w:t>}</w:t>
+      </w:r>
+      <w:r>
+        <w:br/>
+      </w:r>
+      <w:r>
+        <w:br/>
+      </w:r>
+      <w:r>
+        <w:br/>
+      </w:r>
+      <w:r>
+        <w:t xml:space="preserve">&lt;!-- </w:t>
+      </w:r>
+      <w:r>
+        <w:rPr>
+          <w:rFonts w:ascii="Segoe UI Emoji" w:hAnsi="Segoe UI Emoji" w:cs="Segoe UI Emoji"/>
+        </w:rPr>
+        <w:t>🚫</w:t>
+      </w:r>
+      <w:r>
+        <w:t xml:space="preserve"> Remove </w:t>
+      </w:r>
+      <w:proofErr w:type="spellStart"/>
+      <w:r>
+        <w:t>Devtools</w:t>
+      </w:r>
+      <w:proofErr w:type="spellEnd"/>
+      <w:r>
+        <w:t xml:space="preserve"> to fix </w:t>
+      </w:r>
+      <w:proofErr w:type="spellStart"/>
+      <w:r>
+        <w:t>classloader</w:t>
+      </w:r>
+      <w:proofErr w:type="spellEnd"/>
+      <w:r>
+        <w:t xml:space="preserve"> issues --&gt;</w:t>
+      </w:r>
+    </w:p>
+    <w:p>
+      <w:r>
+        <w:t>&lt;!-- Delete this from oms-risk-service/pom.xml --&gt;</w:t>
+      </w:r>
+    </w:p>
+    <w:p>
+      <w:r>
+        <w:t>&lt;dependency&gt;</w:t>
+      </w:r>
+    </w:p>
+    <w:p>
+      <w:r>
+        <w:t xml:space="preserve">    &lt;</w:t>
+      </w:r>
+      <w:proofErr w:type="spellStart"/>
+      <w:r>
+        <w:t>groupId</w:t>
+      </w:r>
+      <w:proofErr w:type="spellEnd"/>
+      <w:r>
+        <w:t>&gt;</w:t>
+      </w:r>
+      <w:proofErr w:type="spellStart"/>
+      <w:r>
+        <w:t>org.springframework.boot</w:t>
+      </w:r>
+      <w:proofErr w:type="spellEnd"/>
+      <w:r>
+        <w:t>&lt;/</w:t>
+      </w:r>
+      <w:proofErr w:type="spellStart"/>
+      <w:r>
+        <w:t>groupId</w:t>
+      </w:r>
+      <w:proofErr w:type="spellEnd"/>
+      <w:r>
+        <w:t>&gt;</w:t>
+      </w:r>
+    </w:p>
+    <w:p>
+      <w:r>
+        <w:t xml:space="preserve">    &lt;</w:t>
+      </w:r>
+      <w:proofErr w:type="spellStart"/>
+      <w:r>
+        <w:t>artifactId</w:t>
+      </w:r>
+      <w:proofErr w:type="spellEnd"/>
+      <w:r>
+        <w:t>&gt;spring-boot-</w:t>
+      </w:r>
+      <w:proofErr w:type="spellStart"/>
+      <w:r>
+        <w:t>devtools</w:t>
+      </w:r>
+      <w:proofErr w:type="spellEnd"/>
+      <w:r>
+        <w:t>&lt;/</w:t>
+      </w:r>
+      <w:proofErr w:type="spellStart"/>
+      <w:r>
+        <w:t>artifactId</w:t>
+      </w:r>
+      <w:proofErr w:type="spellEnd"/>
+      <w:r>
+        <w:t>&gt;</w:t>
+      </w:r>
+    </w:p>
+    <w:p>
+      <w:r>
+        <w:t xml:space="preserve">    &lt;scope&gt;runtime&lt;/scope&gt;</w:t>
+      </w:r>
+    </w:p>
+    <w:p>
+      <w:r>
+        <w:t>&lt;/dependency&gt;</w:t>
+      </w:r>
+      <w:r>
+        <w:br/>
+      </w:r>
+      <w:r>
+        <w:br/>
+      </w:r>
+      <w:r>
+        <w:br/>
+      </w:r>
+      <w:r>
+        <w:br/>
+      </w:r>
+      <w:r>
+        <w:t xml:space="preserve">// </w:t>
+      </w:r>
+      <w:r>
+        <w:rPr>
+          <w:rFonts w:ascii="Segoe UI Emoji" w:hAnsi="Segoe UI Emoji" w:cs="Segoe UI Emoji"/>
+        </w:rPr>
+        <w:t>🔧</w:t>
+      </w:r>
+      <w:r>
+        <w:t xml:space="preserve"> KafkaConsumerConfig.java (custom container factory)</w:t>
+      </w:r>
+    </w:p>
+    <w:p>
+      <w:r>
+        <w:t>@Bean</w:t>
+      </w:r>
+    </w:p>
+    <w:p>
+      <w:r>
+        <w:t xml:space="preserve">public </w:t>
+      </w:r>
+      <w:proofErr w:type="spellStart"/>
+      <w:r>
+        <w:t>ConsumerFactory</w:t>
+      </w:r>
+      <w:proofErr w:type="spellEnd"/>
+      <w:r>
+        <w:t xml:space="preserve">&lt;String, </w:t>
+      </w:r>
+      <w:proofErr w:type="spellStart"/>
+      <w:r>
+        <w:t>OrderPlacedEvent</w:t>
+      </w:r>
+      <w:proofErr w:type="spellEnd"/>
+      <w:r>
+        <w:t xml:space="preserve">&gt; </w:t>
+      </w:r>
+      <w:proofErr w:type="spellStart"/>
+      <w:r>
+        <w:t>consumerFactory</w:t>
+      </w:r>
+      <w:proofErr w:type="spellEnd"/>
+      <w:r>
+        <w:t>() {</w:t>
+      </w:r>
+    </w:p>
+    <w:p>
+      <w:r>
+        <w:t xml:space="preserve">    Map&lt;String, Object&gt; props = new HashMap&lt;&gt;();</w:t>
+      </w:r>
+    </w:p>
+    <w:p>
+      <w:r>
+        <w:t xml:space="preserve">    </w:t>
+      </w:r>
+      <w:proofErr w:type="spellStart"/>
+      <w:r>
+        <w:t>props.put</w:t>
+      </w:r>
+      <w:proofErr w:type="spellEnd"/>
+      <w:r>
+        <w:t>(</w:t>
+      </w:r>
+      <w:proofErr w:type="spellStart"/>
+      <w:r>
+        <w:t>ConsumerConfig.BOOTSTRAP_SERVERS_CONFIG</w:t>
+      </w:r>
+      <w:proofErr w:type="spellEnd"/>
+      <w:r>
+        <w:t>, "localhost:9092");</w:t>
+      </w:r>
+    </w:p>
+    <w:p>
+      <w:r>
+        <w:lastRenderedPageBreak/>
+        <w:t xml:space="preserve">    </w:t>
+      </w:r>
+      <w:proofErr w:type="spellStart"/>
+      <w:r>
+        <w:t>props.put</w:t>
+      </w:r>
+      <w:proofErr w:type="spellEnd"/>
+      <w:r>
+        <w:t>(</w:t>
+      </w:r>
+      <w:proofErr w:type="spellStart"/>
+      <w:r>
+        <w:t>ConsumerConfig.GROUP_ID_CONFIG</w:t>
+      </w:r>
+      <w:proofErr w:type="spellEnd"/>
+      <w:r>
+        <w:t>, "oms-risk-service");</w:t>
+      </w:r>
+    </w:p>
+    <w:p>
+      <w:r>
+        <w:t xml:space="preserve">    </w:t>
+      </w:r>
+      <w:proofErr w:type="spellStart"/>
+      <w:r>
+        <w:t>props.put</w:t>
+      </w:r>
+      <w:proofErr w:type="spellEnd"/>
+      <w:r>
+        <w:t>(</w:t>
+      </w:r>
+      <w:proofErr w:type="spellStart"/>
+      <w:r>
+        <w:t>ConsumerConfig.KEY_DESERIALIZER_CLASS_CONFIG</w:t>
+      </w:r>
+      <w:proofErr w:type="spellEnd"/>
+      <w:r>
+        <w:t xml:space="preserve">, </w:t>
+      </w:r>
+      <w:proofErr w:type="spellStart"/>
+      <w:r>
+        <w:t>StringDeserializer.class</w:t>
+      </w:r>
+      <w:proofErr w:type="spellEnd"/>
+      <w:r>
+        <w:t>);</w:t>
+      </w:r>
+    </w:p>
+    <w:p>
+      <w:r>
+        <w:t xml:space="preserve">    </w:t>
+      </w:r>
+      <w:proofErr w:type="spellStart"/>
+      <w:r>
+        <w:t>props.put</w:t>
+      </w:r>
+      <w:proofErr w:type="spellEnd"/>
+      <w:r>
+        <w:t>(</w:t>
+      </w:r>
+      <w:proofErr w:type="spellStart"/>
+      <w:r>
+        <w:t>ConsumerConfig.VALUE_DESERIALIZER_CLASS_CONFIG</w:t>
+      </w:r>
+      <w:proofErr w:type="spellEnd"/>
+      <w:r>
+        <w:t xml:space="preserve">, </w:t>
+      </w:r>
+      <w:proofErr w:type="spellStart"/>
+      <w:r>
+        <w:t>KafkaAvroDeserializer.class</w:t>
+      </w:r>
+      <w:proofErr w:type="spellEnd"/>
+      <w:r>
+        <w:t>);</w:t>
+      </w:r>
+    </w:p>
+    <w:p>
+      <w:r>
+        <w:t xml:space="preserve">    </w:t>
+      </w:r>
+      <w:proofErr w:type="spellStart"/>
+      <w:r>
+        <w:t>props.put</w:t>
+      </w:r>
+      <w:proofErr w:type="spellEnd"/>
+      <w:r>
+        <w:t>("schema.registry.url", "http://localhost:8081");</w:t>
+      </w:r>
+    </w:p>
+    <w:p>
+      <w:r>
+        <w:t xml:space="preserve">    </w:t>
+      </w:r>
+      <w:proofErr w:type="spellStart"/>
+      <w:r>
+        <w:t>props.put</w:t>
+      </w:r>
+      <w:proofErr w:type="spellEnd"/>
+      <w:r>
+        <w:t>("</w:t>
+      </w:r>
+      <w:proofErr w:type="spellStart"/>
+      <w:r>
+        <w:t>specific.avro.reader</w:t>
+      </w:r>
+      <w:proofErr w:type="spellEnd"/>
+      <w:r>
+        <w:t>", true);</w:t>
+      </w:r>
+    </w:p>
+    <w:p>
+      <w:r>
+        <w:t xml:space="preserve">    return new </w:t>
+      </w:r>
+      <w:proofErr w:type="spellStart"/>
+      <w:r>
+        <w:t>DefaultKafkaConsumerFactory</w:t>
+      </w:r>
+      <w:proofErr w:type="spellEnd"/>
+      <w:r>
+        <w:t>&lt;&gt;(props);</w:t>
+      </w:r>
+    </w:p>
+    <w:p>
+      <w:r>
+        <w:t>}</w:t>
+      </w:r>
+    </w:p>
+    <w:p/>
+    <w:p>
+      <w:r>
+        <w:t>@Bean</w:t>
+      </w:r>
+    </w:p>
+    <w:p>
+      <w:r>
+        <w:t xml:space="preserve">public </w:t>
+      </w:r>
+      <w:proofErr w:type="spellStart"/>
+      <w:r>
+        <w:t>ConcurrentKafkaListenerContainerFactory</w:t>
+      </w:r>
+      <w:proofErr w:type="spellEnd"/>
+      <w:r>
+        <w:t xml:space="preserve">&lt;String, </w:t>
+      </w:r>
+      <w:proofErr w:type="spellStart"/>
+      <w:r>
+        <w:t>OrderPlacedEvent</w:t>
+      </w:r>
+      <w:proofErr w:type="spellEnd"/>
+      <w:r>
+        <w:t xml:space="preserve">&gt; </w:t>
+      </w:r>
+      <w:proofErr w:type="spellStart"/>
+      <w:r>
+        <w:t>kafkaListenerContainerFactory</w:t>
+      </w:r>
+      <w:proofErr w:type="spellEnd"/>
+      <w:r>
+        <w:t>() {</w:t>
+      </w:r>
+    </w:p>
+    <w:p>
+      <w:r>
+        <w:t xml:space="preserve">    </w:t>
+      </w:r>
+      <w:proofErr w:type="spellStart"/>
+      <w:r>
+        <w:t>ConcurrentKafkaListenerContainerFactory</w:t>
+      </w:r>
+      <w:proofErr w:type="spellEnd"/>
+      <w:r>
+        <w:t xml:space="preserve">&lt;String, </w:t>
+      </w:r>
+      <w:proofErr w:type="spellStart"/>
+      <w:r>
+        <w:t>OrderPlacedEvent</w:t>
+      </w:r>
+      <w:proofErr w:type="spellEnd"/>
+      <w:r>
+        <w:t>&gt; factory =</w:t>
+      </w:r>
+    </w:p>
+    <w:p>
+      <w:r>
+        <w:t xml:space="preserve">            new </w:t>
+      </w:r>
+      <w:proofErr w:type="spellStart"/>
+      <w:r>
+        <w:t>ConcurrentKafkaListenerContainerFactory</w:t>
+      </w:r>
+      <w:proofErr w:type="spellEnd"/>
+      <w:r>
+        <w:t>&lt;&gt;();</w:t>
+      </w:r>
+    </w:p>
+    <w:p>
+      <w:r>
+        <w:t xml:space="preserve">    </w:t>
+      </w:r>
+      <w:proofErr w:type="spellStart"/>
+      <w:r>
+        <w:t>factory.setConsumerFactory</w:t>
+      </w:r>
+      <w:proofErr w:type="spellEnd"/>
+      <w:r>
+        <w:t>(</w:t>
+      </w:r>
+      <w:proofErr w:type="spellStart"/>
+      <w:r>
+        <w:t>consumerFactory</w:t>
+      </w:r>
+      <w:proofErr w:type="spellEnd"/>
+      <w:r>
+        <w:t>());</w:t>
+      </w:r>
+    </w:p>
+    <w:p>
+      <w:r>
+        <w:t xml:space="preserve">    return factory;</w:t>
+      </w:r>
+    </w:p>
+    <w:p>
+      <w:r>
+        <w:t>}</w:t>
+      </w:r>
+    </w:p>
     <w:sectPr>
       <w:pgSz w:w="11906" w:h="16838"/>
       <w:pgMar w:top="1440" w:right="1440" w:bottom="1440" w:left="1440" w:header="708" w:footer="708" w:gutter="0"/>
@@ -3352,6 +4572,7 @@
   <w:style w:type="character" w:default="1" w:styleId="DefaultParagraphFont">
     <w:name w:val="Default Paragraph Font"/>
     <w:uiPriority w:val="1"/>
+    <w:semiHidden/>
     <w:unhideWhenUsed/>
   </w:style>
   <w:style w:type="table" w:default="1" w:styleId="TableNormal">

</xml_diff>